<commit_message>
Align submission batches and issues with invoice-level rules
</commit_message>
<xml_diff>
--- a/artifacts/submission-module/Submission Module with Issue Tracker PRD.docx
+++ b/artifacts/submission-module/Submission Module with Issue Tracker PRD.docx
@@ -68,7 +68,7 @@
         <w:pStyle w:val="ListBullet"/>
       </w:pPr>
       <w:r>
-        <w:t>An invoice recorded as submitted manually or externally is excluded from later automatic submission attempts. Only an Agent may correct a completed submission back to Not Submitted. The earlier record remains in the activity history.</w:t>
+        <w:t>An invoice recorded as submitted manually or externally is excluded from later automatic submission attempts. Only an Agent may correct a completed submission back to Not Submitted. The Agent must enter the reason in Remarks. The earlier submission and correction remain in the activity history.</w:t>
       </w:r>
     </w:p>
     <w:p>
@@ -113,6 +113,14 @@
     </w:p>
     <w:p>
       <w:pPr>
+        <w:pStyle w:val="ListBullet"/>
+      </w:pPr>
+      <w:r>
+        <w:t>Changing, pausing or deleting a strategy immediately stops the previous submission plan. Before saving, the administrator sees a warning with the count of invoices scheduled for the next end-of-day run. Pending invoices, including those already in Inebura, are then reassessed against the new strategy, document requirements, delay and recipient list. The earlier plan must not send after the change.</w:t>
+      </w:r>
+    </w:p>
+    <w:p>
+      <w:pPr>
         <w:pStyle w:val="Heading2"/>
       </w:pPr>
       <w:r>
@@ -124,7 +132,7 @@
         <w:pStyle w:val="ListBullet"/>
       </w:pPr>
       <w:r>
-        <w:t>A strategy may enable “Submit multiple invoices in 1 email” and set “Bulk send after” to a whole number of days. The wait starts when each invoice is added to Inebura. It applies to each invoice separately, even when several invoices will share one message.</w:t>
+        <w:t>A strategy may enable “Submit multiple invoices in 1 email” and set “Bulk send after” to a whole number of days from 0 to 365. For each customer, strategy and recipient list, the wait starts when the earliest still-pending invoice in that group was added to Inebura. New invoices in the group do not restart the wait.</w:t>
       </w:r>
     </w:p>
     <w:p>
@@ -132,7 +140,7 @@
         <w:pStyle w:val="ListBullet"/>
       </w:pPr>
       <w:r>
-        <w:t>Only invoices whose waiting period has elapsed and whose required documents are all tagged may join a bulk email. If the last required document arrives after the waiting period, the invoice joins the next scheduled run; the wait does not restart.</w:t>
+        <w:t>At the next scheduled run, the group is sent early if every pending invoice in it has all required documents. Otherwise, the platform waits until the configured deadline. At that deadline it sends only the invoices whose required documents are complete. Incomplete invoices remain Not Submitted. When their last document arrives after the deadline, they join the next run without a new waiting period.</w:t>
       </w:r>
     </w:p>
     <w:p>
@@ -140,7 +148,7 @@
         <w:pStyle w:val="ListBullet"/>
       </w:pPr>
       <w:r>
-        <w:t>Bulk emails group eligible invoices by customer, applicable strategy and recipient list. Different strategies or recipient lists produce separate emails. Sequential document sending is unavailable when bulk invoice sending is enabled.</w:t>
+        <w:t>Bulk emails group invoices by customer, applicable strategy and recipient list. Different strategies or recipient lists produce separate emails. Sequential document sending is unavailable when bulk invoice sending is enabled.</w:t>
       </w:r>
     </w:p>
     <w:p>
@@ -148,7 +156,15 @@
         <w:pStyle w:val="ListBullet"/>
       </w:pPr>
       <w:r>
-        <w:t>The email includes the qualifying invoices and their required documents. An invoice still waiting for a document or its delay is left for a later run, without holding back other eligible invoices.</w:t>
+        <w:t>For each invoice, the backend prepares exactly two attachments: the invoice file and one ZIP containing all supporting documents. These two files stay together in the same email. The total size must fit the configured Outlook client’s current policy. If a customer batch exceeds that limit, split it between invoices into multiple email sends. If one invoice’s two-file package alone exceeds the limit, leave it pending and show the size exception for action; do not split its two attachments. An invoice becomes Submitted only when Outlook accepts the email part containing its package. Invoices in failed parts remain Not Submitted and are retried without duplicating parts already accepted.</w:t>
+      </w:r>
+    </w:p>
+    <w:p>
+      <w:pPr>
+        <w:pStyle w:val="ListBullet"/>
+      </w:pPr>
+      <w:r>
+        <w:t>For example, if seven of ten invoices are document-complete after two days and the configured wait is seven days, no email is sent yet. New invoices added on day three do not extend the original deadline. At the first run on or after day seven, the platform sends every document-complete invoice in that group and leaves every incomplete invoice pending.</w:t>
       </w:r>
     </w:p>
     <w:p>
@@ -188,7 +204,7 @@
         <w:pStyle w:val="ListBullet"/>
       </w:pPr>
       <w:r>
-        <w:t>Where one customer-level document blocks several invoices, the review may group the shared dependency and show its full invoice impact. Invoice-level dependencies remain specific to their invoice. The same affected invoice is counted once in the Needs Review card and panel.</w:t>
+        <w:t>Needs Review counts invoices, even when several invoices lack the same customer-level document. The review page may show a shared dependency for visibility, but choosing Add to issue tracker creates a separate issue for each affected invoice. An issue is never opened automatically from a missing document or review threshold.</w:t>
       </w:r>
     </w:p>
     <w:p>
@@ -262,7 +278,7 @@
     <w:p>
       <w:pPr>
         <w:pStyle w:val="Heading1"/>
-        <w:pageBreakBefore/>
+        <w:pageBreakBefore w:val="0"/>
       </w:pPr>
       <w:r>
         <w:t>Issue ownership, approval and resolution</w:t>
@@ -273,7 +289,7 @@
         <w:pStyle w:val="ListBullet"/>
       </w:pPr>
       <w:r>
-        <w:t>The new issue starts Open and is linked to the invoice, customer, selected reason or document dependency, Action Owner, Approval Process, creator, remarks and creation time. A shared customer-level dependency may link all affected invoices while retaining one issue for that dependency.</w:t>
+        <w:t>Each issue starts Open and is linked to exactly one invoice, its customer, selected reason or document dependency, Action Owner, Approval Process, creator, remarks and creation time. Several invoices blocked by the same customer document have separate issues and can resolve independently.</w:t>
       </w:r>
     </w:p>
     <w:p>
@@ -289,7 +305,7 @@
         <w:pStyle w:val="ListBullet"/>
       </w:pPr>
       <w:r>
-        <w:t>When every required document for a Docs Pending issue becomes available, Inebura clears that reason and closes the linked document issue through the system. Pending approval requests for that issue are superseded. The newly ready invoice may join the next eligible automation run.</w:t>
+        <w:t>When the required document for one invoice’s Docs Pending issue becomes available, Inebura clears that invoice’s Docs Pending reason and closes only its linked issue. Issues for other invoices stay Open until their own document requirements are met. Pending approval requests for a closed issue are superseded. The newly ready invoice may be considered for the next submission run.</w:t>
       </w:r>
     </w:p>
     <w:p>
@@ -306,6 +322,14 @@
       </w:pPr>
       <w:r>
         <w:t>Visibility and history</w:t>
+      </w:r>
+    </w:p>
+    <w:p>
+      <w:pPr>
+        <w:pStyle w:val="ListBullet"/>
+      </w:pPr>
+      <w:r>
+        <w:t>On the AR invoice list, selecting multiple invoices reveals Submit invoices next to Send emails. Its confirmation shows the selected pending count, the count missing required documents and the count ready to submit. The user can submit only the document-complete invoices or cancel. Incomplete invoices remain pending.</w:t>
       </w:r>
     </w:p>
     <w:p>
@@ -335,6 +359,7 @@
     <w:p>
       <w:pPr>
         <w:pStyle w:val="Heading1"/>
+        <w:pageBreakBefore/>
       </w:pPr>
       <w:r>
         <w:t>Acceptance cases</w:t>
@@ -361,7 +386,7 @@
         <w:pStyle w:val="ListBullet"/>
       </w:pPr>
       <w:r>
-        <w:t>A shared missing customer document can affect several invoices without producing one automatic issue per invoice. Review waits for the configured invoice-age threshold unless a user records or assesses the blocker sooner.</w:t>
+        <w:t>A missing customer-level document can affect several invoices, but each user-created issue belongs to one invoice. Attaching a document to one invoice closes only that invoice’s matching Docs Pending issue. Review waits for the configured invoice-age threshold unless a user records or assesses the blocker sooner.</w:t>
       </w:r>
     </w:p>
     <w:p>
@@ -369,7 +394,7 @@
         <w:pStyle w:val="ListBullet"/>
       </w:pPr>
       <w:r>
-        <w:t>Once all documents for a Docs Pending issue are attached, the system closes that issue. If the bulk wait has elapsed, the invoice can join the next scheduled run without another waiting period.</w:t>
+        <w:t>A document-complete group may be sent before the bulk deadline only when all of its pending invoices are complete. At the deadline, complete invoices are sent and incomplete invoices remain pending. A later-completed invoice joins the next run without restarting the wait.</w:t>
       </w:r>
     </w:p>
     <w:p>
@@ -377,7 +402,39 @@
         <w:pStyle w:val="ListBullet"/>
       </w:pPr>
       <w:r>
-        <w:t>A completed manual or external submission is not sent again by automation. Returning it to Not Submitted is available only to an Agent and retains the previous submission in the timeline.</w:t>
+        <w:t>A completed manual or external submission is not sent again by automation. Only an Agent can return it to Not Submitted, and the Agent must record the correction reason in Remarks. The original submission remains visible in the timeline.</w:t>
+      </w:r>
+    </w:p>
+    <w:p>
+      <w:pPr>
+        <w:pStyle w:val="ListBullet"/>
+      </w:pPr>
+      <w:r>
+        <w:t>With a seven-day bulk wait, seven of ten invoices complete after two days, and ten more are added on day three. No email is sent before the deadline while any invoice in the group remains incomplete. The new arrivals do not move that deadline. At the first run after the deadline, all completed invoices are included and six incomplete invoices remain Not Submitted.</w:t>
+      </w:r>
+    </w:p>
+    <w:p>
+      <w:pPr>
+        <w:pStyle w:val="ListBullet"/>
+      </w:pPr>
+      <w:r>
+        <w:t>Editing a strategy that has invoices in the next scheduled run shows their count and warns that the prior run will be stopped. After confirmation, the same pending invoices are reassessed under the new requirements, wait and recipient list.</w:t>
+      </w:r>
+    </w:p>
+    <w:p>
+      <w:pPr>
+        <w:pStyle w:val="ListBullet"/>
+      </w:pPr>
+      <w:r>
+        <w:t>When a customer batch exceeds Outlook’s configured size limit, it is split between invoice packages. Each package retains its invoice file and supporting-document ZIP in one email. A part accepted by Outlook marks only its own invoices Submitted; a failed part leaves only its invoices pending for retry.</w:t>
+      </w:r>
+    </w:p>
+    <w:p>
+      <w:pPr>
+        <w:pStyle w:val="ListBullet"/>
+      </w:pPr>
+      <w:r>
+        <w:t>The Submit invoices bulk action counts selected invoices without complete documents, submits only document-complete invoices when confirmed, and leaves the others pending. Cancelling performs no submission.</w:t>
       </w:r>
     </w:p>
     <w:sectPr>

</xml_diff>